<commit_message>
Actualizacion de templates LOH y positivo CNV + LOH
Co-Authored-By: Claude Opus 5.5 <noreply@anthropic.com>
</commit_message>
<xml_diff>
--- a/templates/LOH.docx
+++ b/templates/LOH.docx
@@ -1,6 +1,6 @@
 
 <file path=word/document.xml><?xml version="1.0" encoding="utf-8"?>
-<w:document xmlns:wpc="http://schemas.microsoft.com/office/word/2010/wordprocessingCanvas" xmlns:cx="http://schemas.microsoft.com/office/drawing/2014/chartex" xmlns:mc="http://schemas.openxmlformats.org/markup-compatibility/2006" xmlns:o="urn:schemas-microsoft-com:office:office" xmlns:r="http://schemas.openxmlformats.org/officeDocument/2006/relationships" xmlns:m="http://schemas.openxmlformats.org/officeDocument/2006/math" xmlns:v="urn:schemas-microsoft-com:vml" xmlns:wp14="http://schemas.microsoft.com/office/word/2010/wordprocessingDrawing" xmlns:wp="http://schemas.openxmlformats.org/drawingml/2006/wordprocessingDrawing" xmlns:w10="urn:schemas-microsoft-com:office:word" xmlns:w="http://schemas.openxmlformats.org/wordprocessingml/2006/main" xmlns:w14="http://schemas.microsoft.com/office/word/2010/wordml" xmlns:w15="http://schemas.microsoft.com/office/word/2012/wordml" xmlns:w16se="http://schemas.microsoft.com/office/word/2015/wordml/symex" xmlns:wpg="http://schemas.microsoft.com/office/word/2010/wordprocessingGroup" xmlns:wpi="http://schemas.microsoft.com/office/word/2010/wordprocessingInk" xmlns:wne="http://schemas.microsoft.com/office/word/2006/wordml" xmlns:wps="http://schemas.microsoft.com/office/word/2010/wordprocessingShape" mc:Ignorable="w14 w15 w16se wp14">
+<w:document xmlns:wpc="http://schemas.microsoft.com/office/word/2010/wordprocessingCanvas" xmlns:cx="http://schemas.microsoft.com/office/drawing/2014/chartex" xmlns:cx1="http://schemas.microsoft.com/office/drawing/2015/9/8/chartex" xmlns:cx2="http://schemas.microsoft.com/office/drawing/2015/10/21/chartex" xmlns:cx3="http://schemas.microsoft.com/office/drawing/2016/5/9/chartex" xmlns:cx4="http://schemas.microsoft.com/office/drawing/2016/5/10/chartex" xmlns:cx5="http://schemas.microsoft.com/office/drawing/2016/5/11/chartex" xmlns:cx6="http://schemas.microsoft.com/office/drawing/2016/5/12/chartex" xmlns:cx7="http://schemas.microsoft.com/office/drawing/2016/5/13/chartex" xmlns:cx8="http://schemas.microsoft.com/office/drawing/2016/5/14/chartex" xmlns:mc="http://schemas.openxmlformats.org/markup-compatibility/2006" xmlns:aink="http://schemas.microsoft.com/office/drawing/2016/ink" xmlns:am3d="http://schemas.microsoft.com/office/drawing/2017/model3d" xmlns:o="urn:schemas-microsoft-com:office:office" xmlns:oel="http://schemas.microsoft.com/office/2019/extlst" xmlns:r="http://schemas.openxmlformats.org/officeDocument/2006/relationships" xmlns:m="http://schemas.openxmlformats.org/officeDocument/2006/math" xmlns:v="urn:schemas-microsoft-com:vml" xmlns:wp14="http://schemas.microsoft.com/office/word/2010/wordprocessingDrawing" xmlns:wp="http://schemas.openxmlformats.org/drawingml/2006/wordprocessingDrawing" xmlns:w10="urn:schemas-microsoft-com:office:word" xmlns:w="http://schemas.openxmlformats.org/wordprocessingml/2006/main" xmlns:w14="http://schemas.microsoft.com/office/word/2010/wordml" xmlns:w15="http://schemas.microsoft.com/office/word/2012/wordml" xmlns:w16cex="http://schemas.microsoft.com/office/word/2018/wordml/cex" xmlns:w16cid="http://schemas.microsoft.com/office/word/2016/wordml/cid" xmlns:w16="http://schemas.microsoft.com/office/word/2018/wordml" xmlns:w16du="http://schemas.microsoft.com/office/word/2023/wordml/word16du" xmlns:w16sdtdh="http://schemas.microsoft.com/office/word/2020/wordml/sdtdatahash" xmlns:w16sdtfl="http://schemas.microsoft.com/office/word/2024/wordml/sdtformatlock" xmlns:w16se="http://schemas.microsoft.com/office/word/2015/wordml/symex" xmlns:wpg="http://schemas.microsoft.com/office/word/2010/wordprocessingGroup" xmlns:wpi="http://schemas.microsoft.com/office/word/2010/wordprocessingInk" xmlns:wne="http://schemas.microsoft.com/office/word/2006/wordml" xmlns:wps="http://schemas.microsoft.com/office/word/2010/wordprocessingShape" mc:Ignorable="w14 w15 w16se w16cid w16 w16cex w16sdtdh w16sdtfl w16du wp14">
   <w:body>
     <w:tbl>
       <w:tblPr>
@@ -157,8 +157,6 @@
               </w:rPr>
               <w:t>{{ FECHA }}</w:t>
             </w:r>
-            <w:bookmarkStart w:id="0" w:name="_GoBack"/>
-            <w:bookmarkEnd w:id="0"/>
           </w:p>
         </w:tc>
       </w:tr>
@@ -296,13 +294,34 @@
         </w:rPr>
         <w:t xml:space="preserve">: </w:t>
       </w:r>
+      <w:r>
+        <w:rPr>
+          <w:sz w:val="22"/>
+          <w:szCs w:val="22"/>
+        </w:rPr>
+        <w:t xml:space="preserve">microdeleciones, </w:t>
+      </w:r>
       <w:proofErr w:type="spellStart"/>
       <w:r>
         <w:rPr>
           <w:sz w:val="22"/>
           <w:szCs w:val="22"/>
         </w:rPr>
-        <w:t>microdeleciones</w:t>
+        <w:t>micro</w:t>
+      </w:r>
+      <w:r>
+        <w:rPr>
+          <w:sz w:val="22"/>
+          <w:szCs w:val="22"/>
+        </w:rPr>
+        <w:t>-</w:t>
+      </w:r>
+      <w:r>
+        <w:rPr>
+          <w:sz w:val="22"/>
+          <w:szCs w:val="22"/>
+        </w:rPr>
+        <w:t>duplicaciones</w:t>
       </w:r>
       <w:proofErr w:type="spellEnd"/>
       <w:r>
@@ -310,21 +329,7 @@
           <w:sz w:val="22"/>
           <w:szCs w:val="22"/>
         </w:rPr>
-        <w:t>, micro</w:t>
-      </w:r>
-      <w:r>
-        <w:rPr>
-          <w:sz w:val="22"/>
-          <w:szCs w:val="22"/>
-        </w:rPr>
-        <w:t>-</w:t>
-      </w:r>
-      <w:r>
-        <w:rPr>
-          <w:sz w:val="22"/>
-          <w:szCs w:val="22"/>
-        </w:rPr>
-        <w:t>duplicaciones y aneuploidías)</w:t>
+        <w:t xml:space="preserve"> y aneuploidías)</w:t>
       </w:r>
       <w:r>
         <w:rPr>
@@ -351,7 +356,7 @@
     </w:p>
     <w:p>
       <w:pPr>
-        <w:pStyle w:val="Prrafodelista"/>
+        <w:pStyle w:val="ListParagraph"/>
         <w:numPr>
           <w:ilvl w:val="0"/>
           <w:numId w:val="4"/>
@@ -400,23 +405,7 @@
           <w:sz w:val="22"/>
           <w:szCs w:val="22"/>
         </w:rPr>
-        <w:t xml:space="preserve"> </w:t>
-      </w:r>
-      <w:proofErr w:type="spellStart"/>
-      <w:r>
-        <w:rPr>
-          <w:sz w:val="22"/>
-          <w:szCs w:val="22"/>
-        </w:rPr>
-        <w:t>Number</w:t>
-      </w:r>
-      <w:proofErr w:type="spellEnd"/>
-      <w:r>
-        <w:rPr>
-          <w:sz w:val="22"/>
-          <w:szCs w:val="22"/>
-        </w:rPr>
-        <w:t xml:space="preserve"> </w:t>
+        <w:t xml:space="preserve"> Number </w:t>
       </w:r>
       <w:proofErr w:type="spellStart"/>
       <w:r>
@@ -437,7 +426,7 @@
     </w:p>
     <w:p>
       <w:pPr>
-        <w:pStyle w:val="Prrafodelista"/>
+        <w:pStyle w:val="ListParagraph"/>
         <w:numPr>
           <w:ilvl w:val="0"/>
           <w:numId w:val="4"/>
@@ -459,7 +448,7 @@
     </w:p>
     <w:p>
       <w:pPr>
-        <w:pStyle w:val="Prrafodelista"/>
+        <w:pStyle w:val="ListParagraph"/>
         <w:numPr>
           <w:ilvl w:val="0"/>
           <w:numId w:val="4"/>
@@ -481,7 +470,7 @@
     </w:p>
     <w:p>
       <w:pPr>
-        <w:pStyle w:val="Prrafodelista"/>
+        <w:pStyle w:val="ListParagraph"/>
         <w:numPr>
           <w:ilvl w:val="0"/>
           <w:numId w:val="4"/>
@@ -503,7 +492,7 @@
     </w:p>
     <w:p>
       <w:pPr>
-        <w:pStyle w:val="Prrafodelista"/>
+        <w:pStyle w:val="ListParagraph"/>
         <w:numPr>
           <w:ilvl w:val="0"/>
           <w:numId w:val="4"/>
@@ -573,7 +562,7 @@
     </w:p>
     <w:p>
       <w:pPr>
-        <w:pStyle w:val="Prrafodelista"/>
+        <w:pStyle w:val="ListParagraph"/>
         <w:numPr>
           <w:ilvl w:val="0"/>
           <w:numId w:val="4"/>
@@ -611,7 +600,7 @@
     </w:p>
     <w:p>
       <w:pPr>
-        <w:pStyle w:val="Prrafodelista"/>
+        <w:pStyle w:val="ListParagraph"/>
         <w:numPr>
           <w:ilvl w:val="0"/>
           <w:numId w:val="4"/>
@@ -633,7 +622,7 @@
     </w:p>
     <w:p>
       <w:pPr>
-        <w:pStyle w:val="Prrafodelista"/>
+        <w:pStyle w:val="ListParagraph"/>
         <w:numPr>
           <w:ilvl w:val="0"/>
           <w:numId w:val="4"/>
@@ -805,7 +794,7 @@
     </w:p>
     <w:tbl>
       <w:tblPr>
-        <w:tblStyle w:val="Tablaconcuadrcula"/>
+        <w:tblStyle w:val="TableGrid"/>
         <w:tblpPr w:leftFromText="141" w:rightFromText="141" w:vertAnchor="text" w:horzAnchor="margin" w:tblpX="-34" w:tblpY="60"/>
         <w:tblW w:w="10490" w:type="dxa"/>
         <w:tblBorders>
@@ -922,10 +911,73 @@
         <w:tc>
           <w:tcPr>
             <w:tcW w:w="2694" w:type="dxa"/>
-            <w:tcBorders>
-              <w:top w:val="double" w:sz="4" w:space="0" w:color="7030A0"/>
-              <w:bottom w:val="double" w:sz="4" w:space="0" w:color="7030A0"/>
-            </w:tcBorders>
+            <w:shd w:val="clear" w:color="auto" w:fill="FFFFFF" w:themeFill="background1"/>
+            <w:vAlign w:val="center"/>
+          </w:tcPr>
+          <w:p>
+            <w:pPr>
+              <w:jc w:val="center"/>
+              <w:rPr>
+                <w:sz w:val="18"/>
+                <w:szCs w:val="18"/>
+                <w:highlight w:val="yellow"/>
+                <w:lang w:val="en-US"/>
+              </w:rPr>
+            </w:pPr>
+            <w:r>
+              <w:rPr>
+                <w:sz w:val="18"/>
+                <w:szCs w:val="18"/>
+                <w:lang w:val="en-US"/>
+              </w:rPr>
+              <w:t>{%tr for l in LOH_REGIONS %}</w:t>
+            </w:r>
+          </w:p>
+        </w:tc>
+        <w:tc>
+          <w:tcPr>
+            <w:tcW w:w="2801" w:type="dxa"/>
+            <w:shd w:val="clear" w:color="auto" w:fill="FFFFFF" w:themeFill="background1"/>
+            <w:vAlign w:val="center"/>
+          </w:tcPr>
+          <w:p>
+            <w:pPr>
+              <w:jc w:val="center"/>
+              <w:rPr>
+                <w:sz w:val="18"/>
+                <w:szCs w:val="18"/>
+                <w:highlight w:val="yellow"/>
+                <w:lang w:val="en-US"/>
+              </w:rPr>
+            </w:pPr>
+          </w:p>
+        </w:tc>
+        <w:tc>
+          <w:tcPr>
+            <w:tcW w:w="4995" w:type="dxa"/>
+            <w:shd w:val="clear" w:color="auto" w:fill="FFFFFF" w:themeFill="background1"/>
+            <w:vAlign w:val="center"/>
+          </w:tcPr>
+          <w:p>
+            <w:pPr>
+              <w:jc w:val="both"/>
+              <w:rPr>
+                <w:sz w:val="18"/>
+                <w:szCs w:val="18"/>
+                <w:highlight w:val="yellow"/>
+                <w:lang w:val="en-US"/>
+              </w:rPr>
+            </w:pPr>
+          </w:p>
+        </w:tc>
+      </w:tr>
+      <w:tr>
+        <w:trPr>
+          <w:trHeight w:val="541"/>
+        </w:trPr>
+        <w:tc>
+          <w:tcPr>
+            <w:tcW w:w="2694" w:type="dxa"/>
             <w:shd w:val="clear" w:color="auto" w:fill="FFFFFF" w:themeFill="background1"/>
             <w:vAlign w:val="center"/>
           </w:tcPr>
@@ -938,241 +990,43 @@
                 <w:highlight w:val="yellow"/>
               </w:rPr>
             </w:pPr>
+            <w:proofErr w:type="gramStart"/>
             <w:r>
               <w:rPr>
                 <w:sz w:val="18"/>
                 <w:szCs w:val="18"/>
               </w:rPr>
-              <w:t>{%tr for l in LOH_REGIONS %}</w:t>
+              <w:t xml:space="preserve">{{ </w:t>
             </w:r>
+            <w:proofErr w:type="spellStart"/>
             <w:r>
               <w:rPr>
                 <w:sz w:val="18"/>
                 <w:szCs w:val="18"/>
               </w:rPr>
+              <w:t>l</w:t>
             </w:r>
+            <w:proofErr w:type="gramEnd"/>
             <w:r>
               <w:rPr>
                 <w:sz w:val="18"/>
                 <w:szCs w:val="18"/>
               </w:rPr>
+              <w:t>.position</w:t>
             </w:r>
+            <w:proofErr w:type="spellEnd"/>
             <w:r>
               <w:rPr>
                 <w:sz w:val="18"/>
                 <w:szCs w:val="18"/>
               </w:rPr>
-            </w:r>
-            <w:r>
-              <w:rPr>
-                <w:sz w:val="18"/>
-                <w:szCs w:val="18"/>
-              </w:rPr>
-            </w:r>
-            <w:r>
-              <w:rPr>
-                <w:sz w:val="18"/>
-                <w:szCs w:val="18"/>
-              </w:rPr>
-            </w:r>
-            <w:r>
-              <w:rPr>
-                <w:sz w:val="18"/>
-                <w:szCs w:val="18"/>
-              </w:rPr>
-            </w:r>
-            <w:r>
-              <w:rPr>
-                <w:sz w:val="18"/>
-                <w:szCs w:val="18"/>
-              </w:rPr>
-            </w:r>
-            <w:r>
-              <w:rPr>
-                <w:sz w:val="18"/>
-                <w:szCs w:val="18"/>
-              </w:rPr>
-            </w:r>
-            <w:r>
-              <w:rPr>
-                <w:sz w:val="18"/>
-                <w:szCs w:val="18"/>
-              </w:rPr>
-            </w:r>
-            <w:r>
-              <w:rPr>
-                <w:sz w:val="18"/>
-                <w:szCs w:val="18"/>
-              </w:rPr>
-            </w:r>
-            <w:r>
-              <w:rPr>
-                <w:sz w:val="18"/>
-                <w:szCs w:val="18"/>
-              </w:rPr>
+              <w:t xml:space="preserve"> }}</w:t>
             </w:r>
           </w:p>
         </w:tc>
         <w:tc>
           <w:tcPr>
             <w:tcW w:w="2801" w:type="dxa"/>
-            <w:tcBorders>
-              <w:top w:val="double" w:sz="4" w:space="0" w:color="7030A0"/>
-              <w:bottom w:val="double" w:sz="4" w:space="0" w:color="7030A0"/>
-            </w:tcBorders>
-            <w:shd w:val="clear" w:color="auto" w:fill="FFFFFF" w:themeFill="background1"/>
-            <w:vAlign w:val="center"/>
-          </w:tcPr>
-          <w:p>
-            <w:pPr>
-              <w:jc w:val="center"/>
-              <w:rPr>
-                <w:sz w:val="18"/>
-                <w:szCs w:val="18"/>
-                <w:highlight w:val="yellow"/>
-              </w:rPr>
-            </w:pPr>
-            <w:r>
-              <w:rPr>
-                <w:sz w:val="18"/>
-                <w:szCs w:val="18"/>
-              </w:rPr>
-            </w:r>
-          </w:p>
-        </w:tc>
-        <w:tc>
-          <w:tcPr>
-            <w:tcW w:w="4995" w:type="dxa"/>
-            <w:tcBorders>
-              <w:top w:val="double" w:sz="4" w:space="0" w:color="7030A0"/>
-              <w:bottom w:val="double" w:sz="4" w:space="0" w:color="7030A0"/>
-            </w:tcBorders>
-            <w:shd w:val="clear" w:color="auto" w:fill="FFFFFF" w:themeFill="background1"/>
-            <w:vAlign w:val="center"/>
-          </w:tcPr>
-          <w:p>
-            <w:pPr>
-              <w:jc w:val="both"/>
-              <w:rPr>
-                <w:sz w:val="18"/>
-                <w:szCs w:val="18"/>
-                <w:highlight w:val="yellow"/>
-              </w:rPr>
-            </w:pPr>
-            <w:r>
-              <w:rPr>
-                <w:sz w:val="18"/>
-                <w:szCs w:val="18"/>
-              </w:rPr>
-            </w:r>
-          </w:p>
-        </w:tc>
-      </w:tr>
-      <w:tr>
-        <w:trPr>
-          <w:trHeight w:val="541"/>
-        </w:trPr>
-        <w:tc>
-          <w:tcPr>
-            <w:tcW w:w="2694" w:type="dxa"/>
-            <w:tcBorders>
-              <w:top w:val="double" w:sz="4" w:space="0" w:color="7030A0"/>
-              <w:bottom w:val="double" w:sz="4" w:space="0" w:color="7030A0"/>
-            </w:tcBorders>
-            <w:shd w:val="clear" w:color="auto" w:fill="FFFFFF" w:themeFill="background1"/>
-            <w:vAlign w:val="center"/>
-          </w:tcPr>
-          <w:p>
-            <w:pPr>
-              <w:jc w:val="center"/>
-              <w:rPr>
-                <w:sz w:val="18"/>
-                <w:szCs w:val="18"/>
-                <w:highlight w:val="yellow"/>
-              </w:rPr>
-            </w:pPr>
-            <w:r>
-              <w:rPr>
-                <w:sz w:val="18"/>
-                <w:szCs w:val="18"/>
-              </w:rPr>
-              <w:t>{{ l.position }}</w:t>
-            </w:r>
-            <w:r>
-              <w:rPr>
-                <w:sz w:val="18"/>
-                <w:szCs w:val="18"/>
-              </w:rPr>
-            </w:r>
-            <w:r>
-              <w:rPr>
-                <w:sz w:val="18"/>
-                <w:szCs w:val="18"/>
-              </w:rPr>
-            </w:r>
-            <w:r>
-              <w:rPr>
-                <w:sz w:val="18"/>
-                <w:szCs w:val="18"/>
-              </w:rPr>
-            </w:r>
-            <w:r>
-              <w:rPr>
-                <w:sz w:val="18"/>
-                <w:szCs w:val="18"/>
-              </w:rPr>
-            </w:r>
-            <w:r>
-              <w:rPr>
-                <w:sz w:val="18"/>
-                <w:szCs w:val="18"/>
-              </w:rPr>
-            </w:r>
-            <w:r>
-              <w:rPr>
-                <w:sz w:val="18"/>
-                <w:szCs w:val="18"/>
-              </w:rPr>
-            </w:r>
-            <w:r>
-              <w:rPr>
-                <w:sz w:val="18"/>
-                <w:szCs w:val="18"/>
-              </w:rPr>
-            </w:r>
-            <w:r>
-              <w:rPr>
-                <w:sz w:val="18"/>
-                <w:szCs w:val="18"/>
-              </w:rPr>
-            </w:r>
-            <w:r>
-              <w:rPr>
-                <w:sz w:val="18"/>
-                <w:szCs w:val="18"/>
-              </w:rPr>
-            </w:r>
-            <w:r>
-              <w:rPr>
-                <w:sz w:val="18"/>
-                <w:szCs w:val="18"/>
-              </w:rPr>
-            </w:r>
-            <w:r>
-              <w:rPr>
-                <w:sz w:val="18"/>
-                <w:szCs w:val="18"/>
-              </w:rPr>
-            </w:r>
-          </w:p>
-        </w:tc>
-        <w:tc>
-          <w:tcPr>
-            <w:tcW w:w="2801" w:type="dxa"/>
-            <w:tcBorders>
-              <w:top w:val="double" w:sz="4" w:space="0" w:color="7030A0"/>
-              <w:bottom w:val="double" w:sz="4" w:space="0" w:color="7030A0"/>
-            </w:tcBorders>
             <w:shd w:val="clear" w:color="auto" w:fill="FFFFFF" w:themeFill="background1"/>
             <w:vAlign w:val="center"/>
           </w:tcPr>
@@ -1197,10 +1051,6 @@
         <w:tc>
           <w:tcPr>
             <w:tcW w:w="4995" w:type="dxa"/>
-            <w:tcBorders>
-              <w:top w:val="double" w:sz="4" w:space="0" w:color="7030A0"/>
-              <w:bottom w:val="double" w:sz="4" w:space="0" w:color="7030A0"/>
-            </w:tcBorders>
             <w:shd w:val="clear" w:color="auto" w:fill="FFFFFF" w:themeFill="background1"/>
             <w:vAlign w:val="center"/>
           </w:tcPr>
@@ -1231,7 +1081,6 @@
           <w:tcPr>
             <w:tcW w:w="2694" w:type="dxa"/>
             <w:tcBorders>
-              <w:top w:val="double" w:sz="4" w:space="0" w:color="7030A0"/>
               <w:bottom w:val="double" w:sz="4" w:space="0" w:color="7030A0"/>
             </w:tcBorders>
             <w:shd w:val="clear" w:color="auto" w:fill="FFFFFF" w:themeFill="background1"/>
@@ -1253,79 +1102,12 @@
               </w:rPr>
               <w:t>{%tr endfor %}</w:t>
             </w:r>
-            <w:r>
-              <w:rPr>
-                <w:sz w:val="18"/>
-                <w:szCs w:val="18"/>
-              </w:rPr>
-            </w:r>
-            <w:r>
-              <w:rPr>
-                <w:sz w:val="18"/>
-                <w:szCs w:val="18"/>
-              </w:rPr>
-            </w:r>
-            <w:r>
-              <w:rPr>
-                <w:sz w:val="18"/>
-                <w:szCs w:val="18"/>
-              </w:rPr>
-            </w:r>
-            <w:r>
-              <w:rPr>
-                <w:sz w:val="18"/>
-                <w:szCs w:val="18"/>
-              </w:rPr>
-            </w:r>
-            <w:r>
-              <w:rPr>
-                <w:sz w:val="18"/>
-                <w:szCs w:val="18"/>
-              </w:rPr>
-            </w:r>
-            <w:r>
-              <w:rPr>
-                <w:sz w:val="18"/>
-                <w:szCs w:val="18"/>
-              </w:rPr>
-            </w:r>
-            <w:r>
-              <w:rPr>
-                <w:sz w:val="18"/>
-                <w:szCs w:val="18"/>
-              </w:rPr>
-            </w:r>
-            <w:r>
-              <w:rPr>
-                <w:sz w:val="18"/>
-                <w:szCs w:val="18"/>
-              </w:rPr>
-            </w:r>
-            <w:r>
-              <w:rPr>
-                <w:sz w:val="18"/>
-                <w:szCs w:val="18"/>
-              </w:rPr>
-            </w:r>
-            <w:r>
-              <w:rPr>
-                <w:sz w:val="18"/>
-                <w:szCs w:val="18"/>
-              </w:rPr>
-            </w:r>
-            <w:r>
-              <w:rPr>
-                <w:sz w:val="18"/>
-                <w:szCs w:val="18"/>
-              </w:rPr>
-            </w:r>
           </w:p>
         </w:tc>
         <w:tc>
           <w:tcPr>
             <w:tcW w:w="2801" w:type="dxa"/>
             <w:tcBorders>
-              <w:top w:val="double" w:sz="4" w:space="0" w:color="7030A0"/>
               <w:bottom w:val="double" w:sz="4" w:space="0" w:color="7030A0"/>
             </w:tcBorders>
             <w:shd w:val="clear" w:color="auto" w:fill="FFFFFF" w:themeFill="background1"/>
@@ -1340,19 +1122,12 @@
                 <w:highlight w:val="yellow"/>
               </w:rPr>
             </w:pPr>
-            <w:r>
-              <w:rPr>
-                <w:sz w:val="18"/>
-                <w:szCs w:val="18"/>
-              </w:rPr>
-            </w:r>
           </w:p>
         </w:tc>
         <w:tc>
           <w:tcPr>
             <w:tcW w:w="4995" w:type="dxa"/>
             <w:tcBorders>
-              <w:top w:val="double" w:sz="4" w:space="0" w:color="7030A0"/>
               <w:bottom w:val="double" w:sz="4" w:space="0" w:color="7030A0"/>
             </w:tcBorders>
             <w:shd w:val="clear" w:color="auto" w:fill="FFFFFF" w:themeFill="background1"/>
@@ -1367,12 +1142,6 @@
                 <w:highlight w:val="yellow"/>
               </w:rPr>
             </w:pPr>
-            <w:r>
-              <w:rPr>
-                <w:sz w:val="18"/>
-                <w:szCs w:val="18"/>
-              </w:rPr>
-            </w:r>
           </w:p>
         </w:tc>
       </w:tr>
@@ -1397,6 +1166,7 @@
         <w:rPr>
           <w:b/>
         </w:rPr>
+        <w:lastRenderedPageBreak/>
         <w:t>Interpretación</w:t>
       </w:r>
     </w:p>
@@ -1419,22 +1189,6 @@
         </w:rPr>
         <w:t>{{ LOH_DETECCION_PHRASE }}</w:t>
       </w:r>
-      <w:proofErr w:type="spellStart"/>
-      <w:r>
-        <w:rPr>
-          <w:bCs/>
-          <w:sz w:val="22"/>
-          <w:szCs w:val="22"/>
-        </w:rPr>
-      </w:r>
-      <w:proofErr w:type="spellEnd"/>
-      <w:r>
-        <w:rPr>
-          <w:bCs/>
-          <w:sz w:val="22"/>
-          <w:szCs w:val="22"/>
-        </w:rPr>
-      </w:r>
     </w:p>
     <w:p>
       <w:pPr>
@@ -1444,20 +1198,33 @@
           <w:bCs/>
           <w:sz w:val="22"/>
           <w:szCs w:val="22"/>
-        </w:rPr>
-      </w:pPr>
-      <w:r>
-        <w:rPr>
-          <w:bCs/>
-          <w:sz w:val="22"/>
-          <w:szCs w:val="22"/>
-        </w:rPr>
-        <w:t>{%p for l in LOH_REGIONS %}</w:t>
-      </w:r>
+          <w:lang w:val="en-US"/>
+        </w:rPr>
+      </w:pPr>
+      <w:r>
+        <w:rPr>
+          <w:bCs/>
+          <w:sz w:val="22"/>
+          <w:szCs w:val="22"/>
+          <w:lang w:val="en-US"/>
+        </w:rPr>
+        <w:t>{%p for l in LOH_</w:t>
+      </w:r>
+      <w:proofErr w:type="gramStart"/>
+      <w:r>
+        <w:rPr>
+          <w:bCs/>
+          <w:sz w:val="22"/>
+          <w:szCs w:val="22"/>
+          <w:lang w:val="en-US"/>
+        </w:rPr>
+        <w:t>REGIONS %}</w:t>
+      </w:r>
+      <w:proofErr w:type="gramEnd"/>
     </w:p>
     <w:p>
       <w:pPr>
-        <w:pStyle w:val="Prrafodelista"/>
+        <w:pStyle w:val="ListParagraph"/>
         <w:numPr>
           <w:ilvl w:val="0"/>
           <w:numId w:val="6"/>
@@ -1476,7 +1243,7 @@
           <w:sz w:val="22"/>
           <w:szCs w:val="22"/>
         </w:rPr>
-        <w:t>la ausencia de heterocigocidad de {{ l.size_mb }} MB en {{ l.position }}.</w:t>
+        <w:t xml:space="preserve">la ausencia de </w:t>
       </w:r>
       <w:proofErr w:type="spellStart"/>
       <w:r>
@@ -1485,6 +1252,7 @@
           <w:sz w:val="22"/>
           <w:szCs w:val="22"/>
         </w:rPr>
+        <w:t>heterocigocidad</w:t>
       </w:r>
       <w:proofErr w:type="spellEnd"/>
       <w:r>
@@ -1493,41 +1261,97 @@
           <w:sz w:val="22"/>
           <w:szCs w:val="22"/>
         </w:rPr>
-      </w:r>
-      <w:r>
-        <w:rPr>
-          <w:bCs/>
-          <w:sz w:val="22"/>
-          <w:szCs w:val="22"/>
-        </w:rPr>
-      </w:r>
-      <w:r>
-        <w:rPr>
-          <w:bCs/>
-          <w:sz w:val="22"/>
-          <w:szCs w:val="22"/>
-        </w:rPr>
-      </w:r>
-      <w:r>
-        <w:rPr>
-          <w:bCs/>
-          <w:sz w:val="22"/>
-          <w:szCs w:val="22"/>
-        </w:rPr>
-      </w:r>
-      <w:r>
-        <w:rPr>
-          <w:bCs/>
-          <w:sz w:val="22"/>
-          <w:szCs w:val="22"/>
-        </w:rPr>
-      </w:r>
-      <w:r>
-        <w:rPr>
-          <w:bCs/>
-          <w:sz w:val="22"/>
-          <w:szCs w:val="22"/>
-        </w:rPr>
+        <w:t xml:space="preserve"> de </w:t>
+      </w:r>
+      <w:proofErr w:type="gramStart"/>
+      <w:r>
+        <w:rPr>
+          <w:bCs/>
+          <w:sz w:val="22"/>
+          <w:szCs w:val="22"/>
+        </w:rPr>
+        <w:t>{{ l</w:t>
+      </w:r>
+      <w:proofErr w:type="gramEnd"/>
+      <w:r>
+        <w:rPr>
+          <w:bCs/>
+          <w:sz w:val="22"/>
+          <w:szCs w:val="22"/>
+        </w:rPr>
+        <w:t>.size_</w:t>
+      </w:r>
+      <w:proofErr w:type="gramStart"/>
+      <w:r>
+        <w:rPr>
+          <w:bCs/>
+          <w:sz w:val="22"/>
+          <w:szCs w:val="22"/>
+        </w:rPr>
+        <w:t>mb }</w:t>
+      </w:r>
+      <w:proofErr w:type="gramEnd"/>
+      <w:r>
+        <w:rPr>
+          <w:bCs/>
+          <w:sz w:val="22"/>
+          <w:szCs w:val="22"/>
+        </w:rPr>
+        <w:t xml:space="preserve">} MB en </w:t>
+      </w:r>
+      <w:proofErr w:type="gramStart"/>
+      <w:r>
+        <w:rPr>
+          <w:bCs/>
+          <w:sz w:val="22"/>
+          <w:szCs w:val="22"/>
+        </w:rPr>
+        <w:t xml:space="preserve">{{ </w:t>
+      </w:r>
+      <w:proofErr w:type="spellStart"/>
+      <w:r>
+        <w:rPr>
+          <w:bCs/>
+          <w:sz w:val="22"/>
+          <w:szCs w:val="22"/>
+        </w:rPr>
+        <w:t>l</w:t>
+      </w:r>
+      <w:proofErr w:type="gramEnd"/>
+      <w:r>
+        <w:rPr>
+          <w:bCs/>
+          <w:sz w:val="22"/>
+          <w:szCs w:val="22"/>
+        </w:rPr>
+        <w:t>.</w:t>
+      </w:r>
+      <w:proofErr w:type="gramStart"/>
+      <w:r>
+        <w:rPr>
+          <w:bCs/>
+          <w:sz w:val="22"/>
+          <w:szCs w:val="22"/>
+        </w:rPr>
+        <w:t>position</w:t>
+      </w:r>
+      <w:proofErr w:type="spellEnd"/>
+      <w:r>
+        <w:rPr>
+          <w:bCs/>
+          <w:sz w:val="22"/>
+          <w:szCs w:val="22"/>
+        </w:rPr>
+        <w:t xml:space="preserve"> }</w:t>
+      </w:r>
+      <w:proofErr w:type="gramEnd"/>
+      <w:r>
+        <w:rPr>
+          <w:bCs/>
+          <w:sz w:val="22"/>
+          <w:szCs w:val="22"/>
+        </w:rPr>
+        <w:t>}.</w:t>
       </w:r>
     </w:p>
     <w:p>
@@ -1773,7 +1597,7 @@
 </file>
 
 <file path=word/endnotes.xml><?xml version="1.0" encoding="utf-8"?>
-<w:endnotes xmlns:wpc="http://schemas.microsoft.com/office/word/2010/wordprocessingCanvas" xmlns:cx="http://schemas.microsoft.com/office/drawing/2014/chartex" xmlns:mc="http://schemas.openxmlformats.org/markup-compatibility/2006" xmlns:o="urn:schemas-microsoft-com:office:office" xmlns:r="http://schemas.openxmlformats.org/officeDocument/2006/relationships" xmlns:m="http://schemas.openxmlformats.org/officeDocument/2006/math" xmlns:v="urn:schemas-microsoft-com:vml" xmlns:wp14="http://schemas.microsoft.com/office/word/2010/wordprocessingDrawing" xmlns:wp="http://schemas.openxmlformats.org/drawingml/2006/wordprocessingDrawing" xmlns:w10="urn:schemas-microsoft-com:office:word" xmlns:w="http://schemas.openxmlformats.org/wordprocessingml/2006/main" xmlns:w14="http://schemas.microsoft.com/office/word/2010/wordml" xmlns:w15="http://schemas.microsoft.com/office/word/2012/wordml" xmlns:w16se="http://schemas.microsoft.com/office/word/2015/wordml/symex" xmlns:wpg="http://schemas.microsoft.com/office/word/2010/wordprocessingGroup" xmlns:wpi="http://schemas.microsoft.com/office/word/2010/wordprocessingInk" xmlns:wne="http://schemas.microsoft.com/office/word/2006/wordml" xmlns:wps="http://schemas.microsoft.com/office/word/2010/wordprocessingShape" mc:Ignorable="w14 w15 w16se wp14">
+<w:endnotes xmlns:wpc="http://schemas.microsoft.com/office/word/2010/wordprocessingCanvas" xmlns:cx="http://schemas.microsoft.com/office/drawing/2014/chartex" xmlns:cx1="http://schemas.microsoft.com/office/drawing/2015/9/8/chartex" xmlns:cx2="http://schemas.microsoft.com/office/drawing/2015/10/21/chartex" xmlns:cx3="http://schemas.microsoft.com/office/drawing/2016/5/9/chartex" xmlns:cx4="http://schemas.microsoft.com/office/drawing/2016/5/10/chartex" xmlns:cx5="http://schemas.microsoft.com/office/drawing/2016/5/11/chartex" xmlns:cx6="http://schemas.microsoft.com/office/drawing/2016/5/12/chartex" xmlns:cx7="http://schemas.microsoft.com/office/drawing/2016/5/13/chartex" xmlns:cx8="http://schemas.microsoft.com/office/drawing/2016/5/14/chartex" xmlns:mc="http://schemas.openxmlformats.org/markup-compatibility/2006" xmlns:aink="http://schemas.microsoft.com/office/drawing/2016/ink" xmlns:am3d="http://schemas.microsoft.com/office/drawing/2017/model3d" xmlns:o="urn:schemas-microsoft-com:office:office" xmlns:oel="http://schemas.microsoft.com/office/2019/extlst" xmlns:r="http://schemas.openxmlformats.org/officeDocument/2006/relationships" xmlns:m="http://schemas.openxmlformats.org/officeDocument/2006/math" xmlns:v="urn:schemas-microsoft-com:vml" xmlns:wp14="http://schemas.microsoft.com/office/word/2010/wordprocessingDrawing" xmlns:wp="http://schemas.openxmlformats.org/drawingml/2006/wordprocessingDrawing" xmlns:w10="urn:schemas-microsoft-com:office:word" xmlns:w="http://schemas.openxmlformats.org/wordprocessingml/2006/main" xmlns:w14="http://schemas.microsoft.com/office/word/2010/wordml" xmlns:w15="http://schemas.microsoft.com/office/word/2012/wordml" xmlns:w16cex="http://schemas.microsoft.com/office/word/2018/wordml/cex" xmlns:w16cid="http://schemas.microsoft.com/office/word/2016/wordml/cid" xmlns:w16="http://schemas.microsoft.com/office/word/2018/wordml" xmlns:w16du="http://schemas.microsoft.com/office/word/2023/wordml/word16du" xmlns:w16sdtdh="http://schemas.microsoft.com/office/word/2020/wordml/sdtdatahash" xmlns:w16sdtfl="http://schemas.microsoft.com/office/word/2024/wordml/sdtformatlock" xmlns:w16se="http://schemas.microsoft.com/office/word/2015/wordml/symex" xmlns:wpg="http://schemas.microsoft.com/office/word/2010/wordprocessingGroup" xmlns:wpi="http://schemas.microsoft.com/office/word/2010/wordprocessingInk" xmlns:wne="http://schemas.microsoft.com/office/word/2006/wordml" xmlns:wps="http://schemas.microsoft.com/office/word/2010/wordprocessingShape" mc:Ignorable="w14 w15 w16se w16cid w16 w16cex w16sdtdh w16sdtfl w16du wp14">
   <w:endnote w:type="separator" w:id="-1">
     <w:p>
       <w:r>
@@ -1792,10 +1616,10 @@
 </file>
 
 <file path=word/footer1.xml><?xml version="1.0" encoding="utf-8"?>
-<w:ftr xmlns:wpc="http://schemas.microsoft.com/office/word/2010/wordprocessingCanvas" xmlns:cx="http://schemas.microsoft.com/office/drawing/2014/chartex" xmlns:mc="http://schemas.openxmlformats.org/markup-compatibility/2006" xmlns:o="urn:schemas-microsoft-com:office:office" xmlns:r="http://schemas.openxmlformats.org/officeDocument/2006/relationships" xmlns:m="http://schemas.openxmlformats.org/officeDocument/2006/math" xmlns:v="urn:schemas-microsoft-com:vml" xmlns:wp14="http://schemas.microsoft.com/office/word/2010/wordprocessingDrawing" xmlns:wp="http://schemas.openxmlformats.org/drawingml/2006/wordprocessingDrawing" xmlns:w10="urn:schemas-microsoft-com:office:word" xmlns:w="http://schemas.openxmlformats.org/wordprocessingml/2006/main" xmlns:w14="http://schemas.microsoft.com/office/word/2010/wordml" xmlns:w15="http://schemas.microsoft.com/office/word/2012/wordml" xmlns:w16se="http://schemas.microsoft.com/office/word/2015/wordml/symex" xmlns:wpg="http://schemas.microsoft.com/office/word/2010/wordprocessingGroup" xmlns:wpi="http://schemas.microsoft.com/office/word/2010/wordprocessingInk" xmlns:wne="http://schemas.microsoft.com/office/word/2006/wordml" xmlns:wps="http://schemas.microsoft.com/office/word/2010/wordprocessingShape" mc:Ignorable="w14 w15 w16se wp14">
+<w:ftr xmlns:wpc="http://schemas.microsoft.com/office/word/2010/wordprocessingCanvas" xmlns:cx="http://schemas.microsoft.com/office/drawing/2014/chartex" xmlns:cx1="http://schemas.microsoft.com/office/drawing/2015/9/8/chartex" xmlns:cx2="http://schemas.microsoft.com/office/drawing/2015/10/21/chartex" xmlns:cx3="http://schemas.microsoft.com/office/drawing/2016/5/9/chartex" xmlns:cx4="http://schemas.microsoft.com/office/drawing/2016/5/10/chartex" xmlns:cx5="http://schemas.microsoft.com/office/drawing/2016/5/11/chartex" xmlns:cx6="http://schemas.microsoft.com/office/drawing/2016/5/12/chartex" xmlns:cx7="http://schemas.microsoft.com/office/drawing/2016/5/13/chartex" xmlns:cx8="http://schemas.microsoft.com/office/drawing/2016/5/14/chartex" xmlns:mc="http://schemas.openxmlformats.org/markup-compatibility/2006" xmlns:aink="http://schemas.microsoft.com/office/drawing/2016/ink" xmlns:am3d="http://schemas.microsoft.com/office/drawing/2017/model3d" xmlns:o="urn:schemas-microsoft-com:office:office" xmlns:oel="http://schemas.microsoft.com/office/2019/extlst" xmlns:r="http://schemas.openxmlformats.org/officeDocument/2006/relationships" xmlns:m="http://schemas.openxmlformats.org/officeDocument/2006/math" xmlns:v="urn:schemas-microsoft-com:vml" xmlns:wp14="http://schemas.microsoft.com/office/word/2010/wordprocessingDrawing" xmlns:wp="http://schemas.openxmlformats.org/drawingml/2006/wordprocessingDrawing" xmlns:w10="urn:schemas-microsoft-com:office:word" xmlns:w="http://schemas.openxmlformats.org/wordprocessingml/2006/main" xmlns:w14="http://schemas.microsoft.com/office/word/2010/wordml" xmlns:w15="http://schemas.microsoft.com/office/word/2012/wordml" xmlns:w16cex="http://schemas.microsoft.com/office/word/2018/wordml/cex" xmlns:w16cid="http://schemas.microsoft.com/office/word/2016/wordml/cid" xmlns:w16="http://schemas.microsoft.com/office/word/2018/wordml" xmlns:w16du="http://schemas.microsoft.com/office/word/2023/wordml/word16du" xmlns:w16sdtdh="http://schemas.microsoft.com/office/word/2020/wordml/sdtdatahash" xmlns:w16sdtfl="http://schemas.microsoft.com/office/word/2024/wordml/sdtformatlock" xmlns:w16se="http://schemas.microsoft.com/office/word/2015/wordml/symex" xmlns:wpg="http://schemas.microsoft.com/office/word/2010/wordprocessingGroup" xmlns:wpi="http://schemas.microsoft.com/office/word/2010/wordprocessingInk" xmlns:wne="http://schemas.microsoft.com/office/word/2006/wordml" xmlns:wps="http://schemas.microsoft.com/office/word/2010/wordprocessingShape" mc:Ignorable="w14 w15 w16se w16cid w16 w16cex w16sdtdh w16sdtfl w16du wp14">
   <w:p>
     <w:pPr>
-      <w:pStyle w:val="Piedepgina"/>
+      <w:pStyle w:val="Footer"/>
       <w:jc w:val="center"/>
       <w:rPr>
         <w:rFonts w:ascii="Trebuchet MS" w:hAnsi="Trebuchet MS"/>
@@ -1814,7 +1638,7 @@
   </w:p>
   <w:p>
     <w:pPr>
-      <w:pStyle w:val="Piedepgina"/>
+      <w:pStyle w:val="Footer"/>
       <w:spacing w:line="276" w:lineRule="auto"/>
       <w:jc w:val="center"/>
       <w:rPr>
@@ -1824,7 +1648,6 @@
         <w:szCs w:val="22"/>
       </w:rPr>
     </w:pPr>
-    <w:proofErr w:type="spellStart"/>
     <w:r>
       <w:rPr>
         <w:rFonts w:ascii="Trebuchet MS" w:hAnsi="Trebuchet MS"/>
@@ -1832,22 +1655,12 @@
         <w:sz w:val="22"/>
         <w:szCs w:val="22"/>
       </w:rPr>
-      <w:t>Genda</w:t>
-    </w:r>
-    <w:proofErr w:type="spellEnd"/>
-    <w:r>
-      <w:rPr>
-        <w:rFonts w:ascii="Trebuchet MS" w:hAnsi="Trebuchet MS"/>
-        <w:color w:val="751F60"/>
-        <w:sz w:val="22"/>
-        <w:szCs w:val="22"/>
-      </w:rPr>
-      <w:t xml:space="preserve"> - Genética y Biología Molecular</w:t>
+      <w:t>Genda - Genética y Biología Molecular</w:t>
     </w:r>
   </w:p>
   <w:p>
     <w:pPr>
-      <w:pStyle w:val="Piedepgina"/>
+      <w:pStyle w:val="Footer"/>
       <w:jc w:val="center"/>
       <w:rPr>
         <w:rFonts w:ascii="Trebuchet MS" w:hAnsi="Trebuchet MS"/>
@@ -1866,7 +1679,7 @@
     <w:hyperlink r:id="rId1" w:history="1">
       <w:r>
         <w:rPr>
-          <w:rStyle w:val="Hipervnculo"/>
+          <w:rStyle w:val="Hyperlink"/>
           <w:rFonts w:ascii="Trebuchet MS" w:hAnsi="Trebuchet MS"/>
           <w:color w:val="auto"/>
           <w:sz w:val="18"/>
@@ -1881,7 +1694,7 @@
 </file>
 
 <file path=word/footnotes.xml><?xml version="1.0" encoding="utf-8"?>
-<w:footnotes xmlns:wpc="http://schemas.microsoft.com/office/word/2010/wordprocessingCanvas" xmlns:cx="http://schemas.microsoft.com/office/drawing/2014/chartex" xmlns:mc="http://schemas.openxmlformats.org/markup-compatibility/2006" xmlns:o="urn:schemas-microsoft-com:office:office" xmlns:r="http://schemas.openxmlformats.org/officeDocument/2006/relationships" xmlns:m="http://schemas.openxmlformats.org/officeDocument/2006/math" xmlns:v="urn:schemas-microsoft-com:vml" xmlns:wp14="http://schemas.microsoft.com/office/word/2010/wordprocessingDrawing" xmlns:wp="http://schemas.openxmlformats.org/drawingml/2006/wordprocessingDrawing" xmlns:w10="urn:schemas-microsoft-com:office:word" xmlns:w="http://schemas.openxmlformats.org/wordprocessingml/2006/main" xmlns:w14="http://schemas.microsoft.com/office/word/2010/wordml" xmlns:w15="http://schemas.microsoft.com/office/word/2012/wordml" xmlns:w16se="http://schemas.microsoft.com/office/word/2015/wordml/symex" xmlns:wpg="http://schemas.microsoft.com/office/word/2010/wordprocessingGroup" xmlns:wpi="http://schemas.microsoft.com/office/word/2010/wordprocessingInk" xmlns:wne="http://schemas.microsoft.com/office/word/2006/wordml" xmlns:wps="http://schemas.microsoft.com/office/word/2010/wordprocessingShape" mc:Ignorable="w14 w15 w16se wp14">
+<w:footnotes xmlns:wpc="http://schemas.microsoft.com/office/word/2010/wordprocessingCanvas" xmlns:cx="http://schemas.microsoft.com/office/drawing/2014/chartex" xmlns:cx1="http://schemas.microsoft.com/office/drawing/2015/9/8/chartex" xmlns:cx2="http://schemas.microsoft.com/office/drawing/2015/10/21/chartex" xmlns:cx3="http://schemas.microsoft.com/office/drawing/2016/5/9/chartex" xmlns:cx4="http://schemas.microsoft.com/office/drawing/2016/5/10/chartex" xmlns:cx5="http://schemas.microsoft.com/office/drawing/2016/5/11/chartex" xmlns:cx6="http://schemas.microsoft.com/office/drawing/2016/5/12/chartex" xmlns:cx7="http://schemas.microsoft.com/office/drawing/2016/5/13/chartex" xmlns:cx8="http://schemas.microsoft.com/office/drawing/2016/5/14/chartex" xmlns:mc="http://schemas.openxmlformats.org/markup-compatibility/2006" xmlns:aink="http://schemas.microsoft.com/office/drawing/2016/ink" xmlns:am3d="http://schemas.microsoft.com/office/drawing/2017/model3d" xmlns:o="urn:schemas-microsoft-com:office:office" xmlns:oel="http://schemas.microsoft.com/office/2019/extlst" xmlns:r="http://schemas.openxmlformats.org/officeDocument/2006/relationships" xmlns:m="http://schemas.openxmlformats.org/officeDocument/2006/math" xmlns:v="urn:schemas-microsoft-com:vml" xmlns:wp14="http://schemas.microsoft.com/office/word/2010/wordprocessingDrawing" xmlns:wp="http://schemas.openxmlformats.org/drawingml/2006/wordprocessingDrawing" xmlns:w10="urn:schemas-microsoft-com:office:word" xmlns:w="http://schemas.openxmlformats.org/wordprocessingml/2006/main" xmlns:w14="http://schemas.microsoft.com/office/word/2010/wordml" xmlns:w15="http://schemas.microsoft.com/office/word/2012/wordml" xmlns:w16cex="http://schemas.microsoft.com/office/word/2018/wordml/cex" xmlns:w16cid="http://schemas.microsoft.com/office/word/2016/wordml/cid" xmlns:w16="http://schemas.microsoft.com/office/word/2018/wordml" xmlns:w16du="http://schemas.microsoft.com/office/word/2023/wordml/word16du" xmlns:w16sdtdh="http://schemas.microsoft.com/office/word/2020/wordml/sdtdatahash" xmlns:w16sdtfl="http://schemas.microsoft.com/office/word/2024/wordml/sdtformatlock" xmlns:w16se="http://schemas.microsoft.com/office/word/2015/wordml/symex" xmlns:wpg="http://schemas.microsoft.com/office/word/2010/wordprocessingGroup" xmlns:wpi="http://schemas.microsoft.com/office/word/2010/wordprocessingInk" xmlns:wne="http://schemas.microsoft.com/office/word/2006/wordml" xmlns:wps="http://schemas.microsoft.com/office/word/2010/wordprocessingShape" mc:Ignorable="w14 w15 w16se w16cid w16 w16cex w16sdtdh w16sdtfl w16du wp14">
   <w:footnote w:type="separator" w:id="-1">
     <w:p>
       <w:r>
@@ -1900,7 +1713,7 @@
 </file>
 
 <file path=word/header1.xml><?xml version="1.0" encoding="utf-8"?>
-<w:hdr xmlns:wpc="http://schemas.microsoft.com/office/word/2010/wordprocessingCanvas" xmlns:cx="http://schemas.microsoft.com/office/drawing/2014/chartex" xmlns:mc="http://schemas.openxmlformats.org/markup-compatibility/2006" xmlns:o="urn:schemas-microsoft-com:office:office" xmlns:r="http://schemas.openxmlformats.org/officeDocument/2006/relationships" xmlns:m="http://schemas.openxmlformats.org/officeDocument/2006/math" xmlns:v="urn:schemas-microsoft-com:vml" xmlns:wp14="http://schemas.microsoft.com/office/word/2010/wordprocessingDrawing" xmlns:wp="http://schemas.openxmlformats.org/drawingml/2006/wordprocessingDrawing" xmlns:w10="urn:schemas-microsoft-com:office:word" xmlns:w="http://schemas.openxmlformats.org/wordprocessingml/2006/main" xmlns:w14="http://schemas.microsoft.com/office/word/2010/wordml" xmlns:w15="http://schemas.microsoft.com/office/word/2012/wordml" xmlns:w16se="http://schemas.microsoft.com/office/word/2015/wordml/symex" xmlns:wpg="http://schemas.microsoft.com/office/word/2010/wordprocessingGroup" xmlns:wpi="http://schemas.microsoft.com/office/word/2010/wordprocessingInk" xmlns:wne="http://schemas.microsoft.com/office/word/2006/wordml" xmlns:wps="http://schemas.microsoft.com/office/word/2010/wordprocessingShape" mc:Ignorable="w14 w15 w16se wp14">
+<w:hdr xmlns:wpc="http://schemas.microsoft.com/office/word/2010/wordprocessingCanvas" xmlns:cx="http://schemas.microsoft.com/office/drawing/2014/chartex" xmlns:cx1="http://schemas.microsoft.com/office/drawing/2015/9/8/chartex" xmlns:cx2="http://schemas.microsoft.com/office/drawing/2015/10/21/chartex" xmlns:cx3="http://schemas.microsoft.com/office/drawing/2016/5/9/chartex" xmlns:cx4="http://schemas.microsoft.com/office/drawing/2016/5/10/chartex" xmlns:cx5="http://schemas.microsoft.com/office/drawing/2016/5/11/chartex" xmlns:cx6="http://schemas.microsoft.com/office/drawing/2016/5/12/chartex" xmlns:cx7="http://schemas.microsoft.com/office/drawing/2016/5/13/chartex" xmlns:cx8="http://schemas.microsoft.com/office/drawing/2016/5/14/chartex" xmlns:mc="http://schemas.openxmlformats.org/markup-compatibility/2006" xmlns:aink="http://schemas.microsoft.com/office/drawing/2016/ink" xmlns:am3d="http://schemas.microsoft.com/office/drawing/2017/model3d" xmlns:o="urn:schemas-microsoft-com:office:office" xmlns:oel="http://schemas.microsoft.com/office/2019/extlst" xmlns:r="http://schemas.openxmlformats.org/officeDocument/2006/relationships" xmlns:m="http://schemas.openxmlformats.org/officeDocument/2006/math" xmlns:v="urn:schemas-microsoft-com:vml" xmlns:wp14="http://schemas.microsoft.com/office/word/2010/wordprocessingDrawing" xmlns:wp="http://schemas.openxmlformats.org/drawingml/2006/wordprocessingDrawing" xmlns:w10="urn:schemas-microsoft-com:office:word" xmlns:w="http://schemas.openxmlformats.org/wordprocessingml/2006/main" xmlns:w14="http://schemas.microsoft.com/office/word/2010/wordml" xmlns:w15="http://schemas.microsoft.com/office/word/2012/wordml" xmlns:w16cex="http://schemas.microsoft.com/office/word/2018/wordml/cex" xmlns:w16cid="http://schemas.microsoft.com/office/word/2016/wordml/cid" xmlns:w16="http://schemas.microsoft.com/office/word/2018/wordml" xmlns:w16du="http://schemas.microsoft.com/office/word/2023/wordml/word16du" xmlns:w16sdtdh="http://schemas.microsoft.com/office/word/2020/wordml/sdtdatahash" xmlns:w16sdtfl="http://schemas.microsoft.com/office/word/2024/wordml/sdtformatlock" xmlns:w16se="http://schemas.microsoft.com/office/word/2015/wordml/symex" xmlns:wpg="http://schemas.microsoft.com/office/word/2010/wordprocessingGroup" xmlns:wpi="http://schemas.microsoft.com/office/word/2010/wordprocessingInk" xmlns:wne="http://schemas.microsoft.com/office/word/2006/wordml" xmlns:wps="http://schemas.microsoft.com/office/word/2010/wordprocessingShape" mc:Ignorable="w14 w15 w16se w16cid w16 w16cex w16sdtdh w16sdtfl w16du wp14">
   <w:p>
     <w:r>
       <w:rPr>
@@ -1962,7 +1775,7 @@
 </file>
 
 <file path=word/numbering.xml><?xml version="1.0" encoding="utf-8"?>
-<w:numbering xmlns:wpc="http://schemas.microsoft.com/office/word/2010/wordprocessingCanvas" xmlns:cx="http://schemas.microsoft.com/office/drawing/2014/chartex" xmlns:mc="http://schemas.openxmlformats.org/markup-compatibility/2006" xmlns:o="urn:schemas-microsoft-com:office:office" xmlns:r="http://schemas.openxmlformats.org/officeDocument/2006/relationships" xmlns:m="http://schemas.openxmlformats.org/officeDocument/2006/math" xmlns:v="urn:schemas-microsoft-com:vml" xmlns:wp14="http://schemas.microsoft.com/office/word/2010/wordprocessingDrawing" xmlns:wp="http://schemas.openxmlformats.org/drawingml/2006/wordprocessingDrawing" xmlns:w10="urn:schemas-microsoft-com:office:word" xmlns:w="http://schemas.openxmlformats.org/wordprocessingml/2006/main" xmlns:w14="http://schemas.microsoft.com/office/word/2010/wordml" xmlns:w15="http://schemas.microsoft.com/office/word/2012/wordml" xmlns:w16se="http://schemas.microsoft.com/office/word/2015/wordml/symex" xmlns:wpg="http://schemas.microsoft.com/office/word/2010/wordprocessingGroup" xmlns:wpi="http://schemas.microsoft.com/office/word/2010/wordprocessingInk" xmlns:wne="http://schemas.microsoft.com/office/word/2006/wordml" xmlns:wps="http://schemas.microsoft.com/office/word/2010/wordprocessingShape" mc:Ignorable="w14 w15 w16se wp14">
+<w:numbering xmlns:wpc="http://schemas.microsoft.com/office/word/2010/wordprocessingCanvas" xmlns:cx="http://schemas.microsoft.com/office/drawing/2014/chartex" xmlns:cx1="http://schemas.microsoft.com/office/drawing/2015/9/8/chartex" xmlns:cx2="http://schemas.microsoft.com/office/drawing/2015/10/21/chartex" xmlns:cx3="http://schemas.microsoft.com/office/drawing/2016/5/9/chartex" xmlns:cx4="http://schemas.microsoft.com/office/drawing/2016/5/10/chartex" xmlns:cx5="http://schemas.microsoft.com/office/drawing/2016/5/11/chartex" xmlns:cx6="http://schemas.microsoft.com/office/drawing/2016/5/12/chartex" xmlns:cx7="http://schemas.microsoft.com/office/drawing/2016/5/13/chartex" xmlns:cx8="http://schemas.microsoft.com/office/drawing/2016/5/14/chartex" xmlns:mc="http://schemas.openxmlformats.org/markup-compatibility/2006" xmlns:aink="http://schemas.microsoft.com/office/drawing/2016/ink" xmlns:am3d="http://schemas.microsoft.com/office/drawing/2017/model3d" xmlns:o="urn:schemas-microsoft-com:office:office" xmlns:oel="http://schemas.microsoft.com/office/2019/extlst" xmlns:r="http://schemas.openxmlformats.org/officeDocument/2006/relationships" xmlns:m="http://schemas.openxmlformats.org/officeDocument/2006/math" xmlns:v="urn:schemas-microsoft-com:vml" xmlns:wp14="http://schemas.microsoft.com/office/word/2010/wordprocessingDrawing" xmlns:wp="http://schemas.openxmlformats.org/drawingml/2006/wordprocessingDrawing" xmlns:w10="urn:schemas-microsoft-com:office:word" xmlns:w="http://schemas.openxmlformats.org/wordprocessingml/2006/main" xmlns:w14="http://schemas.microsoft.com/office/word/2010/wordml" xmlns:w15="http://schemas.microsoft.com/office/word/2012/wordml" xmlns:w16cex="http://schemas.microsoft.com/office/word/2018/wordml/cex" xmlns:w16cid="http://schemas.microsoft.com/office/word/2016/wordml/cid" xmlns:w16="http://schemas.microsoft.com/office/word/2018/wordml" xmlns:w16du="http://schemas.microsoft.com/office/word/2023/wordml/word16du" xmlns:w16sdtdh="http://schemas.microsoft.com/office/word/2020/wordml/sdtdatahash" xmlns:w16sdtfl="http://schemas.microsoft.com/office/word/2024/wordml/sdtformatlock" xmlns:w16se="http://schemas.microsoft.com/office/word/2015/wordml/symex" xmlns:wpg="http://schemas.microsoft.com/office/word/2010/wordprocessingGroup" xmlns:wpi="http://schemas.microsoft.com/office/word/2010/wordprocessingInk" xmlns:wne="http://schemas.microsoft.com/office/word/2006/wordml" xmlns:wps="http://schemas.microsoft.com/office/word/2010/wordprocessingShape" mc:Ignorable="w14 w15 w16se w16cid w16 w16cex w16sdtdh w16sdtfl w16du wp14">
   <w:abstractNum w:abstractNumId="0" w15:restartNumberingAfterBreak="0">
     <w:nsid w:val="1C3E36F7"/>
     <w:multiLevelType w:val="hybridMultilevel"/>
@@ -2639,29 +2452,29 @@
       </w:rPr>
     </w:lvl>
   </w:abstractNum>
-  <w:num w:numId="1">
+  <w:num w:numId="1" w16cid:durableId="350301223">
     <w:abstractNumId w:val="2"/>
   </w:num>
-  <w:num w:numId="2">
+  <w:num w:numId="2" w16cid:durableId="1790274724">
     <w:abstractNumId w:val="1"/>
   </w:num>
-  <w:num w:numId="3">
+  <w:num w:numId="3" w16cid:durableId="1366447595">
     <w:abstractNumId w:val="0"/>
   </w:num>
-  <w:num w:numId="4">
+  <w:num w:numId="4" w16cid:durableId="913785182">
     <w:abstractNumId w:val="5"/>
   </w:num>
-  <w:num w:numId="5">
+  <w:num w:numId="5" w16cid:durableId="85082279">
     <w:abstractNumId w:val="4"/>
   </w:num>
-  <w:num w:numId="6">
+  <w:num w:numId="6" w16cid:durableId="561646282">
     <w:abstractNumId w:val="3"/>
   </w:num>
 </w:numbering>
 </file>
 
 <file path=word/styles.xml><?xml version="1.0" encoding="utf-8"?>
-<w:styles xmlns:mc="http://schemas.openxmlformats.org/markup-compatibility/2006" xmlns:r="http://schemas.openxmlformats.org/officeDocument/2006/relationships" xmlns:w="http://schemas.openxmlformats.org/wordprocessingml/2006/main" xmlns:w14="http://schemas.microsoft.com/office/word/2010/wordml" xmlns:w15="http://schemas.microsoft.com/office/word/2012/wordml" xmlns:w16se="http://schemas.microsoft.com/office/word/2015/wordml/symex" mc:Ignorable="w14 w15 w16se">
+<w:styles xmlns:mc="http://schemas.openxmlformats.org/markup-compatibility/2006" xmlns:r="http://schemas.openxmlformats.org/officeDocument/2006/relationships" xmlns:w="http://schemas.openxmlformats.org/wordprocessingml/2006/main" xmlns:w14="http://schemas.microsoft.com/office/word/2010/wordml" xmlns:w15="http://schemas.microsoft.com/office/word/2012/wordml" xmlns:w16cex="http://schemas.microsoft.com/office/word/2018/wordml/cex" xmlns:w16cid="http://schemas.microsoft.com/office/word/2016/wordml/cid" xmlns:w16="http://schemas.microsoft.com/office/word/2018/wordml" xmlns:w16du="http://schemas.microsoft.com/office/word/2023/wordml/word16du" xmlns:w16sdtdh="http://schemas.microsoft.com/office/word/2020/wordml/sdtdatahash" xmlns:w16sdtfl="http://schemas.microsoft.com/office/word/2024/wordml/sdtformatlock" xmlns:w16se="http://schemas.microsoft.com/office/word/2015/wordml/symex" mc:Ignorable="w14 w15 w16se w16cid w16 w16cex w16sdtdh w16sdtfl w16du">
   <w:docDefaults>
     <w:rPrDefault>
       <w:rPr>
@@ -2671,7 +2484,7 @@
     </w:rPrDefault>
     <w:pPrDefault/>
   </w:docDefaults>
-  <w:latentStyles w:defLockedState="0" w:defUIPriority="99" w:defSemiHidden="0" w:defUnhideWhenUsed="0" w:defQFormat="0" w:count="371">
+  <w:latentStyles w:defLockedState="0" w:defUIPriority="99" w:defSemiHidden="0" w:defUnhideWhenUsed="0" w:defQFormat="0" w:count="376">
     <w:lsdException w:name="Normal" w:uiPriority="0" w:qFormat="1"/>
     <w:lsdException w:name="heading 1" w:uiPriority="9" w:qFormat="1"/>
     <w:lsdException w:name="heading 2" w:semiHidden="1" w:uiPriority="9" w:unhideWhenUsed="1" w:qFormat="1"/>
@@ -3043,6 +2856,11 @@
     <w:lsdException w:name="List Table 5 Dark Accent 6" w:uiPriority="50"/>
     <w:lsdException w:name="List Table 6 Colorful Accent 6" w:uiPriority="51"/>
     <w:lsdException w:name="List Table 7 Colorful Accent 6" w:uiPriority="52"/>
+    <w:lsdException w:name="Mention" w:semiHidden="1" w:unhideWhenUsed="1"/>
+    <w:lsdException w:name="Smart Hyperlink" w:semiHidden="1" w:unhideWhenUsed="1"/>
+    <w:lsdException w:name="Hashtag" w:semiHidden="1" w:unhideWhenUsed="1"/>
+    <w:lsdException w:name="Unresolved Mention" w:semiHidden="1" w:unhideWhenUsed="1"/>
+    <w:lsdException w:name="Smart Link" w:semiHidden="1" w:unhideWhenUsed="1"/>
   </w:latentStyles>
   <w:style w:type="paragraph" w:default="1" w:styleId="Normal">
     <w:name w:val="Normal"/>
@@ -3054,13 +2872,13 @@
       <w:lang w:val="es-ES_tradnl" w:eastAsia="es-ES"/>
     </w:rPr>
   </w:style>
-  <w:style w:type="character" w:default="1" w:styleId="Fuentedeprrafopredeter">
+  <w:style w:type="character" w:default="1" w:styleId="DefaultParagraphFont">
     <w:name w:val="Default Paragraph Font"/>
     <w:uiPriority w:val="1"/>
     <w:semiHidden/>
     <w:unhideWhenUsed/>
   </w:style>
-  <w:style w:type="table" w:default="1" w:styleId="Tablanormal">
+  <w:style w:type="table" w:default="1" w:styleId="TableNormal">
     <w:name w:val="Normal Table"/>
     <w:uiPriority w:val="99"/>
     <w:semiHidden/>
@@ -3075,16 +2893,16 @@
       </w:tblCellMar>
     </w:tblPr>
   </w:style>
-  <w:style w:type="numbering" w:default="1" w:styleId="Sinlista">
+  <w:style w:type="numbering" w:default="1" w:styleId="NoList">
     <w:name w:val="No List"/>
     <w:uiPriority w:val="99"/>
     <w:semiHidden/>
     <w:unhideWhenUsed/>
   </w:style>
-  <w:style w:type="paragraph" w:styleId="Encabezado">
+  <w:style w:type="paragraph" w:styleId="Header">
     <w:name w:val="header"/>
     <w:basedOn w:val="Normal"/>
-    <w:link w:val="EncabezadoCar"/>
+    <w:link w:val="HeaderChar"/>
     <w:uiPriority w:val="99"/>
     <w:unhideWhenUsed/>
     <w:rsid w:val="00B83309"/>
@@ -3095,9 +2913,9 @@
       </w:tabs>
     </w:pPr>
   </w:style>
-  <w:style w:type="character" w:customStyle="1" w:styleId="EncabezadoCar">
-    <w:name w:val="Encabezado Car"/>
-    <w:link w:val="Encabezado"/>
+  <w:style w:type="character" w:customStyle="1" w:styleId="HeaderChar">
+    <w:name w:val="Header Char"/>
+    <w:link w:val="Header"/>
     <w:uiPriority w:val="99"/>
     <w:rsid w:val="00B83309"/>
     <w:rPr>
@@ -3106,10 +2924,10 @@
       <w:lang w:val="es-ES_tradnl" w:eastAsia="es-ES"/>
     </w:rPr>
   </w:style>
-  <w:style w:type="paragraph" w:styleId="Piedepgina">
+  <w:style w:type="paragraph" w:styleId="Footer">
     <w:name w:val="footer"/>
     <w:basedOn w:val="Normal"/>
-    <w:link w:val="PiedepginaCar"/>
+    <w:link w:val="FooterChar"/>
     <w:uiPriority w:val="99"/>
     <w:unhideWhenUsed/>
     <w:rsid w:val="00B83309"/>
@@ -3120,9 +2938,9 @@
       </w:tabs>
     </w:pPr>
   </w:style>
-  <w:style w:type="character" w:customStyle="1" w:styleId="PiedepginaCar">
-    <w:name w:val="Pie de página Car"/>
-    <w:link w:val="Piedepgina"/>
+  <w:style w:type="character" w:customStyle="1" w:styleId="FooterChar">
+    <w:name w:val="Footer Char"/>
+    <w:link w:val="Footer"/>
     <w:uiPriority w:val="99"/>
     <w:rsid w:val="00B83309"/>
     <w:rPr>
@@ -3131,10 +2949,10 @@
       <w:lang w:val="es-ES_tradnl" w:eastAsia="es-ES"/>
     </w:rPr>
   </w:style>
-  <w:style w:type="paragraph" w:styleId="Textodeglobo">
+  <w:style w:type="paragraph" w:styleId="BalloonText">
     <w:name w:val="Balloon Text"/>
     <w:basedOn w:val="Normal"/>
-    <w:link w:val="TextodegloboCar"/>
+    <w:link w:val="BalloonTextChar"/>
     <w:uiPriority w:val="99"/>
     <w:semiHidden/>
     <w:unhideWhenUsed/>
@@ -3145,9 +2963,9 @@
       <w:szCs w:val="16"/>
     </w:rPr>
   </w:style>
-  <w:style w:type="character" w:customStyle="1" w:styleId="TextodegloboCar">
-    <w:name w:val="Texto de globo Car"/>
-    <w:link w:val="Textodeglobo"/>
+  <w:style w:type="character" w:customStyle="1" w:styleId="BalloonTextChar">
+    <w:name w:val="Balloon Text Char"/>
+    <w:link w:val="BalloonText"/>
     <w:uiPriority w:val="99"/>
     <w:semiHidden/>
     <w:rsid w:val="00B83309"/>
@@ -3158,7 +2976,7 @@
       <w:lang w:val="es-ES_tradnl" w:eastAsia="es-ES"/>
     </w:rPr>
   </w:style>
-  <w:style w:type="character" w:styleId="Hipervnculo">
+  <w:style w:type="character" w:styleId="Hyperlink">
     <w:name w:val="Hyperlink"/>
     <w:uiPriority w:val="99"/>
     <w:unhideWhenUsed/>
@@ -3168,9 +2986,9 @@
       <w:u w:val="single"/>
     </w:rPr>
   </w:style>
-  <w:style w:type="table" w:styleId="Tablaconcuadrcula">
+  <w:style w:type="table" w:styleId="TableGrid">
     <w:name w:val="Table Grid"/>
-    <w:basedOn w:val="Tablanormal"/>
+    <w:basedOn w:val="TableNormal"/>
     <w:uiPriority w:val="59"/>
     <w:rsid w:val="00B83309"/>
     <w:tblPr>
@@ -3184,9 +3002,9 @@
       </w:tblBorders>
     </w:tblPr>
   </w:style>
-  <w:style w:type="table" w:styleId="Sombreadoclaro-nfasis4">
+  <w:style w:type="table" w:styleId="LightShading-Accent4">
     <w:name w:val="Light Shading Accent 4"/>
-    <w:basedOn w:val="Tablanormal"/>
+    <w:basedOn w:val="TableNormal"/>
     <w:uiPriority w:val="65"/>
     <w:rsid w:val="00470037"/>
     <w:rPr>
@@ -3277,9 +3095,9 @@
       </w:tcPr>
     </w:tblStylePr>
   </w:style>
-  <w:style w:type="table" w:styleId="Listaclara-nfasis1">
+  <w:style w:type="table" w:styleId="LightList-Accent1">
     <w:name w:val="Light List Accent 1"/>
-    <w:basedOn w:val="Tablanormal"/>
+    <w:basedOn w:val="TableNormal"/>
     <w:uiPriority w:val="66"/>
     <w:rsid w:val="00470037"/>
     <w:tblPr>
@@ -3359,9 +3177,9 @@
       </w:tcPr>
     </w:tblStylePr>
   </w:style>
-  <w:style w:type="table" w:styleId="Cuadrculaclara-nfasis1">
+  <w:style w:type="table" w:styleId="LightGrid-Accent1">
     <w:name w:val="Light Grid Accent 1"/>
-    <w:basedOn w:val="Tablanormal"/>
+    <w:basedOn w:val="TableNormal"/>
     <w:uiPriority w:val="67"/>
     <w:rsid w:val="00470037"/>
     <w:tblPr>
@@ -3479,9 +3297,9 @@
       </w:tcPr>
     </w:tblStylePr>
   </w:style>
-  <w:style w:type="table" w:styleId="Cuadrculamedia3-nfasis1">
+  <w:style w:type="table" w:styleId="MediumGrid3-Accent1">
     <w:name w:val="Medium Grid 3 Accent 1"/>
-    <w:basedOn w:val="Tablanormal"/>
+    <w:basedOn w:val="TableNormal"/>
     <w:uiPriority w:val="64"/>
     <w:rsid w:val="00263835"/>
     <w:tblPr>
@@ -3626,7 +3444,7 @@
   </w:style>
   <w:style w:type="table" w:customStyle="1" w:styleId="Tablanormal11">
     <w:name w:val="Tabla normal 11"/>
-    <w:basedOn w:val="Tablanormal"/>
+    <w:basedOn w:val="TableNormal"/>
     <w:uiPriority w:val="41"/>
     <w:rsid w:val="00CC4BD7"/>
     <w:rPr>
@@ -3690,7 +3508,7 @@
       </w:tcPr>
     </w:tblStylePr>
   </w:style>
-  <w:style w:type="paragraph" w:styleId="Prrafodelista">
+  <w:style w:type="paragraph" w:styleId="ListParagraph">
     <w:name w:val="List Paragraph"/>
     <w:basedOn w:val="Normal"/>
     <w:uiPriority w:val="72"/>

</xml_diff>